<commit_message>
finish the work in 5 sep 2026
</commit_message>
<xml_diff>
--- a/YazdNegar/Templates/YazdUniversity/10_TableOfContents.docx
+++ b/YazdNegar/Templates/YazdUniversity/10_TableOfContents.docx
@@ -1,6 +1,6 @@
 
 <file path=word/document.xml><?xml version="1.0" encoding="utf-8"?>
-<w:document xmlns:wpc="http://schemas.microsoft.com/office/word/2010/wordprocessingCanvas" xmlns:cx="http://schemas.microsoft.com/office/drawing/2014/chartex" xmlns:cx1="http://schemas.microsoft.com/office/drawing/2015/9/8/chartex" xmlns:cx2="http://schemas.microsoft.com/office/drawing/2015/10/21/chartex" xmlns:cx3="http://schemas.microsoft.com/office/drawing/2016/5/9/chartex" xmlns:cx4="http://schemas.microsoft.com/office/drawing/2016/5/10/chartex" xmlns:cx5="http://schemas.microsoft.com/office/drawing/2016/5/11/chartex" xmlns:cx6="http://schemas.microsoft.com/office/drawing/2016/5/12/chartex" xmlns:cx7="http://schemas.microsoft.com/office/drawing/2016/5/13/chartex" xmlns:cx8="http://schemas.microsoft.com/office/drawing/2016/5/14/chartex" xmlns:mc="http://schemas.openxmlformats.org/markup-compatibility/2006" xmlns:aink="http://schemas.microsoft.com/office/drawing/2016/ink" xmlns:am3d="http://schemas.microsoft.com/office/drawing/2017/model3d" xmlns:o="urn:schemas-microsoft-com:office:office" xmlns:oel="http://schemas.microsoft.com/office/2019/extlst" xmlns:r="http://schemas.openxmlformats.org/officeDocument/2006/relationships" xmlns:m="http://schemas.openxmlformats.org/officeDocument/2006/math" xmlns:v="urn:schemas-microsoft-com:vml" xmlns:wp14="http://schemas.microsoft.com/office/word/2010/wordprocessingDrawing" xmlns:wp="http://schemas.openxmlformats.org/drawingml/2006/wordprocessingDrawing" xmlns:w10="urn:schemas-microsoft-com:office:word" xmlns:w="http://schemas.openxmlformats.org/wordprocessingml/2006/main" xmlns:w14="http://schemas.microsoft.com/office/word/2010/wordml" xmlns:w15="http://schemas.microsoft.com/office/word/2012/wordml" xmlns:w16cex="http://schemas.microsoft.com/office/word/2018/wordml/cex" xmlns:w16cid="http://schemas.microsoft.com/office/word/2016/wordml/cid" xmlns:w16="http://schemas.microsoft.com/office/word/2018/wordml" xmlns:w16du="http://schemas.microsoft.com/office/word/2023/wordml/word16du" xmlns:w16sdtdh="http://schemas.microsoft.com/office/word/2020/wordml/sdtdatahash" xmlns:w16se="http://schemas.microsoft.com/office/word/2015/wordml/symex" xmlns:wpg="http://schemas.microsoft.com/office/word/2010/wordprocessingGroup" xmlns:wpi="http://schemas.microsoft.com/office/word/2010/wordprocessingInk" xmlns:wne="http://schemas.microsoft.com/office/word/2006/wordml" xmlns:wps="http://schemas.microsoft.com/office/word/2010/wordprocessingShape" mc:Ignorable="w14 w15 w16se w16cid w16 w16cex w16sdtdh w16du wp14">
+<w:document xmlns:wpc="http://schemas.microsoft.com/office/word/2010/wordprocessingCanvas" xmlns:cx="http://schemas.microsoft.com/office/drawing/2014/chartex" xmlns:cx1="http://schemas.microsoft.com/office/drawing/2015/9/8/chartex" xmlns:cx2="http://schemas.microsoft.com/office/drawing/2015/10/21/chartex" xmlns:cx3="http://schemas.microsoft.com/office/drawing/2016/5/9/chartex" xmlns:cx4="http://schemas.microsoft.com/office/drawing/2016/5/10/chartex" xmlns:cx5="http://schemas.microsoft.com/office/drawing/2016/5/11/chartex" xmlns:cx6="http://schemas.microsoft.com/office/drawing/2016/5/12/chartex" xmlns:cx7="http://schemas.microsoft.com/office/drawing/2016/5/13/chartex" xmlns:cx8="http://schemas.microsoft.com/office/drawing/2016/5/14/chartex" xmlns:mc="http://schemas.openxmlformats.org/markup-compatibility/2006" xmlns:aink="http://schemas.microsoft.com/office/drawing/2016/ink" xmlns:am3d="http://schemas.microsoft.com/office/drawing/2017/model3d" xmlns:o="urn:schemas-microsoft-com:office:office" xmlns:oel="http://schemas.microsoft.com/office/2019/extlst" xmlns:r="http://schemas.openxmlformats.org/officeDocument/2006/relationships" xmlns:m="http://schemas.openxmlformats.org/officeDocument/2006/math" xmlns:v="urn:schemas-microsoft-com:vml" xmlns:wp14="http://schemas.microsoft.com/office/word/2010/wordprocessingDrawing" xmlns:wp="http://schemas.openxmlformats.org/drawingml/2006/wordprocessingDrawing" xmlns:w10="urn:schemas-microsoft-com:office:word" xmlns:w="http://schemas.openxmlformats.org/wordprocessingml/2006/main" xmlns:w14="http://schemas.microsoft.com/office/word/2010/wordml" xmlns:w15="http://schemas.microsoft.com/office/word/2012/wordml" xmlns:w16cex="http://schemas.microsoft.com/office/word/2018/wordml/cex" xmlns:w16cid="http://schemas.microsoft.com/office/word/2016/wordml/cid" xmlns:w16="http://schemas.microsoft.com/office/word/2018/wordml" xmlns:w16du="http://schemas.microsoft.com/office/word/2023/wordml/word16du" xmlns:w16sdtdh="http://schemas.microsoft.com/office/word/2020/wordml/sdtdatahash" xmlns:w16sdtfl="http://schemas.microsoft.com/office/word/2024/wordml/sdtformatlock" xmlns:w16se="http://schemas.microsoft.com/office/word/2015/wordml/symex" xmlns:wpg="http://schemas.microsoft.com/office/word/2010/wordprocessingGroup" xmlns:wpi="http://schemas.microsoft.com/office/word/2010/wordprocessingInk" xmlns:wne="http://schemas.microsoft.com/office/word/2006/wordml" xmlns:wps="http://schemas.microsoft.com/office/word/2010/wordprocessingShape" mc:Ignorable="w14 w15 w16se w16cid w16 w16cex w16sdtdh w16sdtfl w16du wp14">
   <w:body>
     <w:p>
       <w:pPr>
@@ -30,6 +30,7 @@
     <w:sdt>
       <w:sdtPr>
         <w:rPr>
+          <w:szCs w:val="24"/>
           <w:rtl/>
           <w:lang w:bidi="fa-IR"/>
         </w:rPr>
@@ -49,9 +50,7 @@
         <w:p>
           <w:pPr>
             <w:rPr>
-              <w:b/>
-              <w:bCs/>
-              <w:rtl/>
+              <w:szCs w:val="24"/>
               <w:lang w:bidi="fa-IR"/>
             </w:rPr>
           </w:pPr>
@@ -59,6 +58,7 @@
             <w:rPr>
               <w:b/>
               <w:bCs/>
+              <w:szCs w:val="24"/>
               <w:lang w:bidi="fa-IR"/>
             </w:rPr>
             <w:fldChar w:fldCharType="begin"/>
@@ -67,6 +67,7 @@
             <w:rPr>
               <w:b/>
               <w:bCs/>
+              <w:szCs w:val="24"/>
               <w:lang w:bidi="fa-IR"/>
             </w:rPr>
             <w:instrText xml:space="preserve"> TOC \o "1-9" \h \z \u </w:instrText>
@@ -75,18 +76,21 @@
             <w:rPr>
               <w:b/>
               <w:bCs/>
+              <w:szCs w:val="24"/>
               <w:lang w:bidi="fa-IR"/>
             </w:rPr>
             <w:fldChar w:fldCharType="separate"/>
           </w:r>
           <w:r>
             <w:rPr>
+              <w:szCs w:val="24"/>
               <w:rtl/>
             </w:rPr>
             <w:t xml:space="preserve"> </w:t>
           </w:r>
           <w:r>
             <w:rPr>
+              <w:szCs w:val="24"/>
               <w:rtl/>
               <w:lang w:bidi="fa-IR"/>
             </w:rPr>
@@ -95,6 +99,7 @@
           <w:r>
             <w:rPr>
               <w:rFonts w:hint="cs"/>
+              <w:szCs w:val="24"/>
               <w:rtl/>
               <w:lang w:bidi="fa-IR"/>
             </w:rPr>
@@ -103,6 +108,7 @@
           <w:r>
             <w:rPr>
               <w:rFonts w:hint="eastAsia"/>
+              <w:szCs w:val="24"/>
               <w:rtl/>
               <w:lang w:bidi="fa-IR"/>
             </w:rPr>
@@ -110,6 +116,7 @@
           </w:r>
           <w:r>
             <w:rPr>
+              <w:szCs w:val="24"/>
               <w:rtl/>
               <w:lang w:bidi="fa-IR"/>
             </w:rPr>
@@ -118,21 +125,15 @@
           <w:r>
             <w:rPr>
               <w:rFonts w:hint="cs"/>
+              <w:szCs w:val="24"/>
               <w:rtl/>
               <w:lang w:bidi="fa-IR"/>
             </w:rPr>
-            <w:t>ی</w:t>
+            <w:t>ی برای</w:t>
           </w:r>
           <w:r>
             <w:rPr>
-              <w:rFonts w:hint="cs"/>
-              <w:rtl/>
-              <w:lang w:bidi="fa-IR"/>
-            </w:rPr>
-            <w:t xml:space="preserve"> برای</w:t>
-          </w:r>
-          <w:r>
-            <w:rPr>
+              <w:szCs w:val="24"/>
               <w:rtl/>
               <w:lang w:bidi="fa-IR"/>
             </w:rPr>
@@ -141,6 +142,7 @@
           <w:r>
             <w:rPr>
               <w:rFonts w:hint="cs"/>
+              <w:szCs w:val="24"/>
               <w:rtl/>
               <w:lang w:bidi="fa-IR"/>
             </w:rPr>
@@ -149,6 +151,7 @@
           <w:r>
             <w:rPr>
               <w:rFonts w:hint="eastAsia"/>
+              <w:szCs w:val="24"/>
               <w:rtl/>
               <w:lang w:bidi="fa-IR"/>
             </w:rPr>
@@ -156,6 +159,7 @@
           </w:r>
           <w:r>
             <w:rPr>
+              <w:szCs w:val="24"/>
               <w:rtl/>
               <w:lang w:bidi="fa-IR"/>
             </w:rPr>
@@ -163,26 +167,47 @@
           </w:r>
           <w:r>
             <w:rPr>
+              <w:szCs w:val="24"/>
               <w:lang w:bidi="fa-IR"/>
             </w:rPr>
             <w:t>.</w:t>
           </w:r>
           <w:r>
             <w:rPr>
+              <w:szCs w:val="24"/>
               <w:lang w:bidi="fa-IR"/>
             </w:rPr>
             <w:fldChar w:fldCharType="end"/>
           </w:r>
         </w:p>
+        <w:p>
+          <w:pPr>
+            <w:rPr>
+              <w:szCs w:val="24"/>
+              <w:lang w:bidi="fa-IR"/>
+            </w:rPr>
+          </w:pPr>
+        </w:p>
+        <w:p>
+          <w:pPr>
+            <w:rPr>
+              <w:szCs w:val="24"/>
+              <w:lang w:bidi="fa-IR"/>
+            </w:rPr>
+          </w:pPr>
+        </w:p>
+        <w:p>
+          <w:pPr>
+            <w:rPr>
+              <w:b/>
+              <w:bCs/>
+              <w:szCs w:val="24"/>
+              <w:lang w:bidi="fa-IR"/>
+            </w:rPr>
+          </w:pPr>
+        </w:p>
       </w:sdtContent>
     </w:sdt>
-    <w:p>
-      <w:pPr>
-        <w:rPr>
-          <w:lang w:bidi="fa-IR"/>
-        </w:rPr>
-      </w:pPr>
-    </w:p>
     <w:sectPr>
       <w:headerReference w:type="default" r:id="rId8"/>
       <w:footerReference w:type="default" r:id="rId9"/>
@@ -199,7 +224,7 @@
 </file>
 
 <file path=word/endnotes.xml><?xml version="1.0" encoding="utf-8"?>
-<w:endnotes xmlns:wpc="http://schemas.microsoft.com/office/word/2010/wordprocessingCanvas" xmlns:cx="http://schemas.microsoft.com/office/drawing/2014/chartex" xmlns:cx1="http://schemas.microsoft.com/office/drawing/2015/9/8/chartex" xmlns:cx2="http://schemas.microsoft.com/office/drawing/2015/10/21/chartex" xmlns:cx3="http://schemas.microsoft.com/office/drawing/2016/5/9/chartex" xmlns:cx4="http://schemas.microsoft.com/office/drawing/2016/5/10/chartex" xmlns:cx5="http://schemas.microsoft.com/office/drawing/2016/5/11/chartex" xmlns:cx6="http://schemas.microsoft.com/office/drawing/2016/5/12/chartex" xmlns:cx7="http://schemas.microsoft.com/office/drawing/2016/5/13/chartex" xmlns:cx8="http://schemas.microsoft.com/office/drawing/2016/5/14/chartex" xmlns:mc="http://schemas.openxmlformats.org/markup-compatibility/2006" xmlns:aink="http://schemas.microsoft.com/office/drawing/2016/ink" xmlns:am3d="http://schemas.microsoft.com/office/drawing/2017/model3d" xmlns:o="urn:schemas-microsoft-com:office:office" xmlns:oel="http://schemas.microsoft.com/office/2019/extlst" xmlns:r="http://schemas.openxmlformats.org/officeDocument/2006/relationships" xmlns:m="http://schemas.openxmlformats.org/officeDocument/2006/math" xmlns:v="urn:schemas-microsoft-com:vml" xmlns:wp14="http://schemas.microsoft.com/office/word/2010/wordprocessingDrawing" xmlns:wp="http://schemas.openxmlformats.org/drawingml/2006/wordprocessingDrawing" xmlns:w10="urn:schemas-microsoft-com:office:word" xmlns:w="http://schemas.openxmlformats.org/wordprocessingml/2006/main" xmlns:w14="http://schemas.microsoft.com/office/word/2010/wordml" xmlns:w15="http://schemas.microsoft.com/office/word/2012/wordml" xmlns:w16cex="http://schemas.microsoft.com/office/word/2018/wordml/cex" xmlns:w16cid="http://schemas.microsoft.com/office/word/2016/wordml/cid" xmlns:w16="http://schemas.microsoft.com/office/word/2018/wordml" xmlns:w16du="http://schemas.microsoft.com/office/word/2023/wordml/word16du" xmlns:w16sdtdh="http://schemas.microsoft.com/office/word/2020/wordml/sdtdatahash" xmlns:w16se="http://schemas.microsoft.com/office/word/2015/wordml/symex" xmlns:wpg="http://schemas.microsoft.com/office/word/2010/wordprocessingGroup" xmlns:wpi="http://schemas.microsoft.com/office/word/2010/wordprocessingInk" xmlns:wne="http://schemas.microsoft.com/office/word/2006/wordml" xmlns:wps="http://schemas.microsoft.com/office/word/2010/wordprocessingShape" mc:Ignorable="w14 w15 w16se w16cid w16 w16cex w16sdtdh w16du wp14">
+<w:endnotes xmlns:wpc="http://schemas.microsoft.com/office/word/2010/wordprocessingCanvas" xmlns:cx="http://schemas.microsoft.com/office/drawing/2014/chartex" xmlns:cx1="http://schemas.microsoft.com/office/drawing/2015/9/8/chartex" xmlns:cx2="http://schemas.microsoft.com/office/drawing/2015/10/21/chartex" xmlns:cx3="http://schemas.microsoft.com/office/drawing/2016/5/9/chartex" xmlns:cx4="http://schemas.microsoft.com/office/drawing/2016/5/10/chartex" xmlns:cx5="http://schemas.microsoft.com/office/drawing/2016/5/11/chartex" xmlns:cx6="http://schemas.microsoft.com/office/drawing/2016/5/12/chartex" xmlns:cx7="http://schemas.microsoft.com/office/drawing/2016/5/13/chartex" xmlns:cx8="http://schemas.microsoft.com/office/drawing/2016/5/14/chartex" xmlns:mc="http://schemas.openxmlformats.org/markup-compatibility/2006" xmlns:aink="http://schemas.microsoft.com/office/drawing/2016/ink" xmlns:am3d="http://schemas.microsoft.com/office/drawing/2017/model3d" xmlns:o="urn:schemas-microsoft-com:office:office" xmlns:oel="http://schemas.microsoft.com/office/2019/extlst" xmlns:r="http://schemas.openxmlformats.org/officeDocument/2006/relationships" xmlns:m="http://schemas.openxmlformats.org/officeDocument/2006/math" xmlns:v="urn:schemas-microsoft-com:vml" xmlns:wp14="http://schemas.microsoft.com/office/word/2010/wordprocessingDrawing" xmlns:wp="http://schemas.openxmlformats.org/drawingml/2006/wordprocessingDrawing" xmlns:w10="urn:schemas-microsoft-com:office:word" xmlns:w="http://schemas.openxmlformats.org/wordprocessingml/2006/main" xmlns:w14="http://schemas.microsoft.com/office/word/2010/wordml" xmlns:w15="http://schemas.microsoft.com/office/word/2012/wordml" xmlns:w16cex="http://schemas.microsoft.com/office/word/2018/wordml/cex" xmlns:w16cid="http://schemas.microsoft.com/office/word/2016/wordml/cid" xmlns:w16="http://schemas.microsoft.com/office/word/2018/wordml" xmlns:w16du="http://schemas.microsoft.com/office/word/2023/wordml/word16du" xmlns:w16sdtdh="http://schemas.microsoft.com/office/word/2020/wordml/sdtdatahash" xmlns:w16sdtfl="http://schemas.microsoft.com/office/word/2024/wordml/sdtformatlock" xmlns:w16se="http://schemas.microsoft.com/office/word/2015/wordml/symex" xmlns:wpg="http://schemas.microsoft.com/office/word/2010/wordprocessingGroup" xmlns:wpi="http://schemas.microsoft.com/office/word/2010/wordprocessingInk" xmlns:wne="http://schemas.microsoft.com/office/word/2006/wordml" xmlns:wps="http://schemas.microsoft.com/office/word/2010/wordprocessingShape" mc:Ignorable="w14 w15 w16se w16cid w16 w16cex w16sdtdh w16sdtfl w16du wp14">
   <w:endnote w:type="separator" w:id="-1">
     <w:p>
       <w:pPr>
@@ -224,7 +249,7 @@
 </file>
 
 <file path=word/footer1.xml><?xml version="1.0" encoding="utf-8"?>
-<w:ftr xmlns:wpc="http://schemas.microsoft.com/office/word/2010/wordprocessingCanvas" xmlns:cx="http://schemas.microsoft.com/office/drawing/2014/chartex" xmlns:cx1="http://schemas.microsoft.com/office/drawing/2015/9/8/chartex" xmlns:cx2="http://schemas.microsoft.com/office/drawing/2015/10/21/chartex" xmlns:cx3="http://schemas.microsoft.com/office/drawing/2016/5/9/chartex" xmlns:cx4="http://schemas.microsoft.com/office/drawing/2016/5/10/chartex" xmlns:cx5="http://schemas.microsoft.com/office/drawing/2016/5/11/chartex" xmlns:cx6="http://schemas.microsoft.com/office/drawing/2016/5/12/chartex" xmlns:cx7="http://schemas.microsoft.com/office/drawing/2016/5/13/chartex" xmlns:cx8="http://schemas.microsoft.com/office/drawing/2016/5/14/chartex" xmlns:mc="http://schemas.openxmlformats.org/markup-compatibility/2006" xmlns:aink="http://schemas.microsoft.com/office/drawing/2016/ink" xmlns:am3d="http://schemas.microsoft.com/office/drawing/2017/model3d" xmlns:o="urn:schemas-microsoft-com:office:office" xmlns:oel="http://schemas.microsoft.com/office/2019/extlst" xmlns:r="http://schemas.openxmlformats.org/officeDocument/2006/relationships" xmlns:m="http://schemas.openxmlformats.org/officeDocument/2006/math" xmlns:v="urn:schemas-microsoft-com:vml" xmlns:wp14="http://schemas.microsoft.com/office/word/2010/wordprocessingDrawing" xmlns:wp="http://schemas.openxmlformats.org/drawingml/2006/wordprocessingDrawing" xmlns:w10="urn:schemas-microsoft-com:office:word" xmlns:w="http://schemas.openxmlformats.org/wordprocessingml/2006/main" xmlns:w14="http://schemas.microsoft.com/office/word/2010/wordml" xmlns:w15="http://schemas.microsoft.com/office/word/2012/wordml" xmlns:w16cex="http://schemas.microsoft.com/office/word/2018/wordml/cex" xmlns:w16cid="http://schemas.microsoft.com/office/word/2016/wordml/cid" xmlns:w16="http://schemas.microsoft.com/office/word/2018/wordml" xmlns:w16du="http://schemas.microsoft.com/office/word/2023/wordml/word16du" xmlns:w16sdtdh="http://schemas.microsoft.com/office/word/2020/wordml/sdtdatahash" xmlns:w16se="http://schemas.microsoft.com/office/word/2015/wordml/symex" xmlns:wpg="http://schemas.microsoft.com/office/word/2010/wordprocessingGroup" xmlns:wpi="http://schemas.microsoft.com/office/word/2010/wordprocessingInk" xmlns:wne="http://schemas.microsoft.com/office/word/2006/wordml" xmlns:wps="http://schemas.microsoft.com/office/word/2010/wordprocessingShape" mc:Ignorable="w14 w15 w16se w16cid w16 w16cex w16sdtdh w16du wp14">
+<w:ftr xmlns:wpc="http://schemas.microsoft.com/office/word/2010/wordprocessingCanvas" xmlns:cx="http://schemas.microsoft.com/office/drawing/2014/chartex" xmlns:cx1="http://schemas.microsoft.com/office/drawing/2015/9/8/chartex" xmlns:cx2="http://schemas.microsoft.com/office/drawing/2015/10/21/chartex" xmlns:cx3="http://schemas.microsoft.com/office/drawing/2016/5/9/chartex" xmlns:cx4="http://schemas.microsoft.com/office/drawing/2016/5/10/chartex" xmlns:cx5="http://schemas.microsoft.com/office/drawing/2016/5/11/chartex" xmlns:cx6="http://schemas.microsoft.com/office/drawing/2016/5/12/chartex" xmlns:cx7="http://schemas.microsoft.com/office/drawing/2016/5/13/chartex" xmlns:cx8="http://schemas.microsoft.com/office/drawing/2016/5/14/chartex" xmlns:mc="http://schemas.openxmlformats.org/markup-compatibility/2006" xmlns:aink="http://schemas.microsoft.com/office/drawing/2016/ink" xmlns:am3d="http://schemas.microsoft.com/office/drawing/2017/model3d" xmlns:o="urn:schemas-microsoft-com:office:office" xmlns:oel="http://schemas.microsoft.com/office/2019/extlst" xmlns:r="http://schemas.openxmlformats.org/officeDocument/2006/relationships" xmlns:m="http://schemas.openxmlformats.org/officeDocument/2006/math" xmlns:v="urn:schemas-microsoft-com:vml" xmlns:wp14="http://schemas.microsoft.com/office/word/2010/wordprocessingDrawing" xmlns:wp="http://schemas.openxmlformats.org/drawingml/2006/wordprocessingDrawing" xmlns:w10="urn:schemas-microsoft-com:office:word" xmlns:w="http://schemas.openxmlformats.org/wordprocessingml/2006/main" xmlns:w14="http://schemas.microsoft.com/office/word/2010/wordml" xmlns:w15="http://schemas.microsoft.com/office/word/2012/wordml" xmlns:w16cex="http://schemas.microsoft.com/office/word/2018/wordml/cex" xmlns:w16cid="http://schemas.microsoft.com/office/word/2016/wordml/cid" xmlns:w16="http://schemas.microsoft.com/office/word/2018/wordml" xmlns:w16du="http://schemas.microsoft.com/office/word/2023/wordml/word16du" xmlns:w16sdtdh="http://schemas.microsoft.com/office/word/2020/wordml/sdtdatahash" xmlns:w16sdtfl="http://schemas.microsoft.com/office/word/2024/wordml/sdtformatlock" xmlns:w16se="http://schemas.microsoft.com/office/word/2015/wordml/symex" xmlns:wpg="http://schemas.microsoft.com/office/word/2010/wordprocessingGroup" xmlns:wpi="http://schemas.microsoft.com/office/word/2010/wordprocessingInk" xmlns:wne="http://schemas.microsoft.com/office/word/2006/wordml" xmlns:wps="http://schemas.microsoft.com/office/word/2010/wordprocessingShape" mc:Ignorable="w14 w15 w16se w16cid w16 w16cex w16sdtdh w16sdtfl w16du wp14">
   <w:sdt>
     <w:sdtPr>
       <w:rPr>
@@ -236,7 +261,6 @@
         <w:docPartUnique/>
       </w:docPartObj>
     </w:sdtPr>
-    <w:sdtEndPr/>
     <w:sdtContent>
       <w:p>
         <w:pPr>
@@ -260,7 +284,13 @@
           <w:rPr>
             <w:rtl/>
           </w:rPr>
-          <w:t>‌أ</w:t>
+          <w:t>‌</w:t>
+        </w:r>
+        <w:r>
+          <w:rPr>
+            <w:rtl/>
+          </w:rPr>
+          <w:t>أ</w:t>
         </w:r>
         <w:r>
           <w:fldChar w:fldCharType="end"/>
@@ -272,7 +302,7 @@
 </file>
 
 <file path=word/footnotes.xml><?xml version="1.0" encoding="utf-8"?>
-<w:footnotes xmlns:wpc="http://schemas.microsoft.com/office/word/2010/wordprocessingCanvas" xmlns:cx="http://schemas.microsoft.com/office/drawing/2014/chartex" xmlns:cx1="http://schemas.microsoft.com/office/drawing/2015/9/8/chartex" xmlns:cx2="http://schemas.microsoft.com/office/drawing/2015/10/21/chartex" xmlns:cx3="http://schemas.microsoft.com/office/drawing/2016/5/9/chartex" xmlns:cx4="http://schemas.microsoft.com/office/drawing/2016/5/10/chartex" xmlns:cx5="http://schemas.microsoft.com/office/drawing/2016/5/11/chartex" xmlns:cx6="http://schemas.microsoft.com/office/drawing/2016/5/12/chartex" xmlns:cx7="http://schemas.microsoft.com/office/drawing/2016/5/13/chartex" xmlns:cx8="http://schemas.microsoft.com/office/drawing/2016/5/14/chartex" xmlns:mc="http://schemas.openxmlformats.org/markup-compatibility/2006" xmlns:aink="http://schemas.microsoft.com/office/drawing/2016/ink" xmlns:am3d="http://schemas.microsoft.com/office/drawing/2017/model3d" xmlns:o="urn:schemas-microsoft-com:office:office" xmlns:oel="http://schemas.microsoft.com/office/2019/extlst" xmlns:r="http://schemas.openxmlformats.org/officeDocument/2006/relationships" xmlns:m="http://schemas.openxmlformats.org/officeDocument/2006/math" xmlns:v="urn:schemas-microsoft-com:vml" xmlns:wp14="http://schemas.microsoft.com/office/word/2010/wordprocessingDrawing" xmlns:wp="http://schemas.openxmlformats.org/drawingml/2006/wordprocessingDrawing" xmlns:w10="urn:schemas-microsoft-com:office:word" xmlns:w="http://schemas.openxmlformats.org/wordprocessingml/2006/main" xmlns:w14="http://schemas.microsoft.com/office/word/2010/wordml" xmlns:w15="http://schemas.microsoft.com/office/word/2012/wordml" xmlns:w16cex="http://schemas.microsoft.com/office/word/2018/wordml/cex" xmlns:w16cid="http://schemas.microsoft.com/office/word/2016/wordml/cid" xmlns:w16="http://schemas.microsoft.com/office/word/2018/wordml" xmlns:w16du="http://schemas.microsoft.com/office/word/2023/wordml/word16du" xmlns:w16sdtdh="http://schemas.microsoft.com/office/word/2020/wordml/sdtdatahash" xmlns:w16se="http://schemas.microsoft.com/office/word/2015/wordml/symex" xmlns:wpg="http://schemas.microsoft.com/office/word/2010/wordprocessingGroup" xmlns:wpi="http://schemas.microsoft.com/office/word/2010/wordprocessingInk" xmlns:wne="http://schemas.microsoft.com/office/word/2006/wordml" xmlns:wps="http://schemas.microsoft.com/office/word/2010/wordprocessingShape" mc:Ignorable="w14 w15 w16se w16cid w16 w16cex w16sdtdh w16du wp14">
+<w:footnotes xmlns:wpc="http://schemas.microsoft.com/office/word/2010/wordprocessingCanvas" xmlns:cx="http://schemas.microsoft.com/office/drawing/2014/chartex" xmlns:cx1="http://schemas.microsoft.com/office/drawing/2015/9/8/chartex" xmlns:cx2="http://schemas.microsoft.com/office/drawing/2015/10/21/chartex" xmlns:cx3="http://schemas.microsoft.com/office/drawing/2016/5/9/chartex" xmlns:cx4="http://schemas.microsoft.com/office/drawing/2016/5/10/chartex" xmlns:cx5="http://schemas.microsoft.com/office/drawing/2016/5/11/chartex" xmlns:cx6="http://schemas.microsoft.com/office/drawing/2016/5/12/chartex" xmlns:cx7="http://schemas.microsoft.com/office/drawing/2016/5/13/chartex" xmlns:cx8="http://schemas.microsoft.com/office/drawing/2016/5/14/chartex" xmlns:mc="http://schemas.openxmlformats.org/markup-compatibility/2006" xmlns:aink="http://schemas.microsoft.com/office/drawing/2016/ink" xmlns:am3d="http://schemas.microsoft.com/office/drawing/2017/model3d" xmlns:o="urn:schemas-microsoft-com:office:office" xmlns:oel="http://schemas.microsoft.com/office/2019/extlst" xmlns:r="http://schemas.openxmlformats.org/officeDocument/2006/relationships" xmlns:m="http://schemas.openxmlformats.org/officeDocument/2006/math" xmlns:v="urn:schemas-microsoft-com:vml" xmlns:wp14="http://schemas.microsoft.com/office/word/2010/wordprocessingDrawing" xmlns:wp="http://schemas.openxmlformats.org/drawingml/2006/wordprocessingDrawing" xmlns:w10="urn:schemas-microsoft-com:office:word" xmlns:w="http://schemas.openxmlformats.org/wordprocessingml/2006/main" xmlns:w14="http://schemas.microsoft.com/office/word/2010/wordml" xmlns:w15="http://schemas.microsoft.com/office/word/2012/wordml" xmlns:w16cex="http://schemas.microsoft.com/office/word/2018/wordml/cex" xmlns:w16cid="http://schemas.microsoft.com/office/word/2016/wordml/cid" xmlns:w16="http://schemas.microsoft.com/office/word/2018/wordml" xmlns:w16du="http://schemas.microsoft.com/office/word/2023/wordml/word16du" xmlns:w16sdtdh="http://schemas.microsoft.com/office/word/2020/wordml/sdtdatahash" xmlns:w16sdtfl="http://schemas.microsoft.com/office/word/2024/wordml/sdtformatlock" xmlns:w16se="http://schemas.microsoft.com/office/word/2015/wordml/symex" xmlns:wpg="http://schemas.microsoft.com/office/word/2010/wordprocessingGroup" xmlns:wpi="http://schemas.microsoft.com/office/word/2010/wordprocessingInk" xmlns:wne="http://schemas.microsoft.com/office/word/2006/wordml" xmlns:wps="http://schemas.microsoft.com/office/word/2010/wordprocessingShape" mc:Ignorable="w14 w15 w16se w16cid w16 w16cex w16sdtdh w16sdtfl w16du wp14">
   <w:footnote w:type="separator" w:id="-1">
     <w:p>
       <w:pPr>
@@ -297,7 +327,7 @@
 </file>
 
 <file path=word/header1.xml><?xml version="1.0" encoding="utf-8"?>
-<w:hdr xmlns:wpc="http://schemas.microsoft.com/office/word/2010/wordprocessingCanvas" xmlns:cx="http://schemas.microsoft.com/office/drawing/2014/chartex" xmlns:cx1="http://schemas.microsoft.com/office/drawing/2015/9/8/chartex" xmlns:cx2="http://schemas.microsoft.com/office/drawing/2015/10/21/chartex" xmlns:cx3="http://schemas.microsoft.com/office/drawing/2016/5/9/chartex" xmlns:cx4="http://schemas.microsoft.com/office/drawing/2016/5/10/chartex" xmlns:cx5="http://schemas.microsoft.com/office/drawing/2016/5/11/chartex" xmlns:cx6="http://schemas.microsoft.com/office/drawing/2016/5/12/chartex" xmlns:cx7="http://schemas.microsoft.com/office/drawing/2016/5/13/chartex" xmlns:cx8="http://schemas.microsoft.com/office/drawing/2016/5/14/chartex" xmlns:mc="http://schemas.openxmlformats.org/markup-compatibility/2006" xmlns:aink="http://schemas.microsoft.com/office/drawing/2016/ink" xmlns:am3d="http://schemas.microsoft.com/office/drawing/2017/model3d" xmlns:o="urn:schemas-microsoft-com:office:office" xmlns:oel="http://schemas.microsoft.com/office/2019/extlst" xmlns:r="http://schemas.openxmlformats.org/officeDocument/2006/relationships" xmlns:m="http://schemas.openxmlformats.org/officeDocument/2006/math" xmlns:v="urn:schemas-microsoft-com:vml" xmlns:wp14="http://schemas.microsoft.com/office/word/2010/wordprocessingDrawing" xmlns:wp="http://schemas.openxmlformats.org/drawingml/2006/wordprocessingDrawing" xmlns:w10="urn:schemas-microsoft-com:office:word" xmlns:w="http://schemas.openxmlformats.org/wordprocessingml/2006/main" xmlns:w14="http://schemas.microsoft.com/office/word/2010/wordml" xmlns:w15="http://schemas.microsoft.com/office/word/2012/wordml" xmlns:w16cex="http://schemas.microsoft.com/office/word/2018/wordml/cex" xmlns:w16cid="http://schemas.microsoft.com/office/word/2016/wordml/cid" xmlns:w16="http://schemas.microsoft.com/office/word/2018/wordml" xmlns:w16du="http://schemas.microsoft.com/office/word/2023/wordml/word16du" xmlns:w16sdtdh="http://schemas.microsoft.com/office/word/2020/wordml/sdtdatahash" xmlns:w16se="http://schemas.microsoft.com/office/word/2015/wordml/symex" xmlns:wpg="http://schemas.microsoft.com/office/word/2010/wordprocessingGroup" xmlns:wpi="http://schemas.microsoft.com/office/word/2010/wordprocessingInk" xmlns:wne="http://schemas.microsoft.com/office/word/2006/wordml" xmlns:wps="http://schemas.microsoft.com/office/word/2010/wordprocessingShape" mc:Ignorable="w14 w15 w16se w16cid w16 w16cex w16sdtdh w16du wp14">
+<w:hdr xmlns:wpc="http://schemas.microsoft.com/office/word/2010/wordprocessingCanvas" xmlns:cx="http://schemas.microsoft.com/office/drawing/2014/chartex" xmlns:cx1="http://schemas.microsoft.com/office/drawing/2015/9/8/chartex" xmlns:cx2="http://schemas.microsoft.com/office/drawing/2015/10/21/chartex" xmlns:cx3="http://schemas.microsoft.com/office/drawing/2016/5/9/chartex" xmlns:cx4="http://schemas.microsoft.com/office/drawing/2016/5/10/chartex" xmlns:cx5="http://schemas.microsoft.com/office/drawing/2016/5/11/chartex" xmlns:cx6="http://schemas.microsoft.com/office/drawing/2016/5/12/chartex" xmlns:cx7="http://schemas.microsoft.com/office/drawing/2016/5/13/chartex" xmlns:cx8="http://schemas.microsoft.com/office/drawing/2016/5/14/chartex" xmlns:mc="http://schemas.openxmlformats.org/markup-compatibility/2006" xmlns:aink="http://schemas.microsoft.com/office/drawing/2016/ink" xmlns:am3d="http://schemas.microsoft.com/office/drawing/2017/model3d" xmlns:o="urn:schemas-microsoft-com:office:office" xmlns:oel="http://schemas.microsoft.com/office/2019/extlst" xmlns:r="http://schemas.openxmlformats.org/officeDocument/2006/relationships" xmlns:m="http://schemas.openxmlformats.org/officeDocument/2006/math" xmlns:v="urn:schemas-microsoft-com:vml" xmlns:wp14="http://schemas.microsoft.com/office/word/2010/wordprocessingDrawing" xmlns:wp="http://schemas.openxmlformats.org/drawingml/2006/wordprocessingDrawing" xmlns:w10="urn:schemas-microsoft-com:office:word" xmlns:w="http://schemas.openxmlformats.org/wordprocessingml/2006/main" xmlns:w14="http://schemas.microsoft.com/office/word/2010/wordml" xmlns:w15="http://schemas.microsoft.com/office/word/2012/wordml" xmlns:w16cex="http://schemas.microsoft.com/office/word/2018/wordml/cex" xmlns:w16cid="http://schemas.microsoft.com/office/word/2016/wordml/cid" xmlns:w16="http://schemas.microsoft.com/office/word/2018/wordml" xmlns:w16du="http://schemas.microsoft.com/office/word/2023/wordml/word16du" xmlns:w16sdtdh="http://schemas.microsoft.com/office/word/2020/wordml/sdtdatahash" xmlns:w16sdtfl="http://schemas.microsoft.com/office/word/2024/wordml/sdtformatlock" xmlns:w16se="http://schemas.microsoft.com/office/word/2015/wordml/symex" xmlns:wpg="http://schemas.microsoft.com/office/word/2010/wordprocessingGroup" xmlns:wpi="http://schemas.microsoft.com/office/word/2010/wordprocessingInk" xmlns:wne="http://schemas.microsoft.com/office/word/2006/wordml" xmlns:wps="http://schemas.microsoft.com/office/word/2010/wordprocessingShape" mc:Ignorable="w14 w15 w16se w16cid w16 w16cex w16sdtdh w16sdtfl w16du wp14">
   <w:p>
     <w:pPr>
       <w:pStyle w:val="Header"/>
@@ -314,11 +344,11 @@
 </file>
 
 <file path=word/numbering.xml><?xml version="1.0" encoding="utf-8"?>
-<w:numbering xmlns:wpc="http://schemas.microsoft.com/office/word/2010/wordprocessingCanvas" xmlns:cx="http://schemas.microsoft.com/office/drawing/2014/chartex" xmlns:cx1="http://schemas.microsoft.com/office/drawing/2015/9/8/chartex" xmlns:cx2="http://schemas.microsoft.com/office/drawing/2015/10/21/chartex" xmlns:cx3="http://schemas.microsoft.com/office/drawing/2016/5/9/chartex" xmlns:cx4="http://schemas.microsoft.com/office/drawing/2016/5/10/chartex" xmlns:cx5="http://schemas.microsoft.com/office/drawing/2016/5/11/chartex" xmlns:cx6="http://schemas.microsoft.com/office/drawing/2016/5/12/chartex" xmlns:cx7="http://schemas.microsoft.com/office/drawing/2016/5/13/chartex" xmlns:cx8="http://schemas.microsoft.com/office/drawing/2016/5/14/chartex" xmlns:mc="http://schemas.openxmlformats.org/markup-compatibility/2006" xmlns:aink="http://schemas.microsoft.com/office/drawing/2016/ink" xmlns:am3d="http://schemas.microsoft.com/office/drawing/2017/model3d" xmlns:o="urn:schemas-microsoft-com:office:office" xmlns:oel="http://schemas.microsoft.com/office/2019/extlst" xmlns:r="http://schemas.openxmlformats.org/officeDocument/2006/relationships" xmlns:m="http://schemas.openxmlformats.org/officeDocument/2006/math" xmlns:v="urn:schemas-microsoft-com:vml" xmlns:wp14="http://schemas.microsoft.com/office/word/2010/wordprocessingDrawing" xmlns:wp="http://schemas.openxmlformats.org/drawingml/2006/wordprocessingDrawing" xmlns:w10="urn:schemas-microsoft-com:office:word" xmlns:w="http://schemas.openxmlformats.org/wordprocessingml/2006/main" xmlns:w14="http://schemas.microsoft.com/office/word/2010/wordml" xmlns:w15="http://schemas.microsoft.com/office/word/2012/wordml" xmlns:w16cex="http://schemas.microsoft.com/office/word/2018/wordml/cex" xmlns:w16cid="http://schemas.microsoft.com/office/word/2016/wordml/cid" xmlns:w16="http://schemas.microsoft.com/office/word/2018/wordml" xmlns:w16du="http://schemas.microsoft.com/office/word/2023/wordml/word16du" xmlns:w16sdtdh="http://schemas.microsoft.com/office/word/2020/wordml/sdtdatahash" xmlns:w16se="http://schemas.microsoft.com/office/word/2015/wordml/symex" xmlns:wpg="http://schemas.microsoft.com/office/word/2010/wordprocessingGroup" xmlns:wpi="http://schemas.microsoft.com/office/word/2010/wordprocessingInk" xmlns:wne="http://schemas.microsoft.com/office/word/2006/wordml" xmlns:wps="http://schemas.microsoft.com/office/word/2010/wordprocessingShape" mc:Ignorable="w14 w15 w16se w16cid w16 w16cex w16sdtdh w16du wp14">
+<w:numbering xmlns:wpc="http://schemas.microsoft.com/office/word/2010/wordprocessingCanvas" xmlns:cx="http://schemas.microsoft.com/office/drawing/2014/chartex" xmlns:cx1="http://schemas.microsoft.com/office/drawing/2015/9/8/chartex" xmlns:cx2="http://schemas.microsoft.com/office/drawing/2015/10/21/chartex" xmlns:cx3="http://schemas.microsoft.com/office/drawing/2016/5/9/chartex" xmlns:cx4="http://schemas.microsoft.com/office/drawing/2016/5/10/chartex" xmlns:cx5="http://schemas.microsoft.com/office/drawing/2016/5/11/chartex" xmlns:cx6="http://schemas.microsoft.com/office/drawing/2016/5/12/chartex" xmlns:cx7="http://schemas.microsoft.com/office/drawing/2016/5/13/chartex" xmlns:cx8="http://schemas.microsoft.com/office/drawing/2016/5/14/chartex" xmlns:mc="http://schemas.openxmlformats.org/markup-compatibility/2006" xmlns:aink="http://schemas.microsoft.com/office/drawing/2016/ink" xmlns:am3d="http://schemas.microsoft.com/office/drawing/2017/model3d" xmlns:o="urn:schemas-microsoft-com:office:office" xmlns:oel="http://schemas.microsoft.com/office/2019/extlst" xmlns:r="http://schemas.openxmlformats.org/officeDocument/2006/relationships" xmlns:m="http://schemas.openxmlformats.org/officeDocument/2006/math" xmlns:v="urn:schemas-microsoft-com:vml" xmlns:wp14="http://schemas.microsoft.com/office/word/2010/wordprocessingDrawing" xmlns:wp="http://schemas.openxmlformats.org/drawingml/2006/wordprocessingDrawing" xmlns:w10="urn:schemas-microsoft-com:office:word" xmlns:w="http://schemas.openxmlformats.org/wordprocessingml/2006/main" xmlns:w14="http://schemas.microsoft.com/office/word/2010/wordml" xmlns:w15="http://schemas.microsoft.com/office/word/2012/wordml" xmlns:w16cex="http://schemas.microsoft.com/office/word/2018/wordml/cex" xmlns:w16cid="http://schemas.microsoft.com/office/word/2016/wordml/cid" xmlns:w16="http://schemas.microsoft.com/office/word/2018/wordml" xmlns:w16du="http://schemas.microsoft.com/office/word/2023/wordml/word16du" xmlns:w16sdtdh="http://schemas.microsoft.com/office/word/2020/wordml/sdtdatahash" xmlns:w16sdtfl="http://schemas.microsoft.com/office/word/2024/wordml/sdtformatlock" xmlns:w16se="http://schemas.microsoft.com/office/word/2015/wordml/symex" xmlns:wpg="http://schemas.microsoft.com/office/word/2010/wordprocessingGroup" xmlns:wpi="http://schemas.microsoft.com/office/word/2010/wordprocessingInk" xmlns:wne="http://schemas.microsoft.com/office/word/2006/wordml" xmlns:wps="http://schemas.microsoft.com/office/word/2010/wordprocessingShape" mc:Ignorable="w14 w15 w16se w16cid w16 w16cex w16sdtdh w16sdtfl w16du wp14">
   <w:abstractNum w:abstractNumId="0" w15:restartNumberingAfterBreak="0">
     <w:nsid w:val="2034206F"/>
     <w:multiLevelType w:val="multilevel"/>
-    <w:tmpl w:val="DA2C7A6C"/>
+    <w:tmpl w:val="F370BAD4"/>
     <w:lvl w:ilvl="0">
       <w:start w:val="1"/>
       <w:numFmt w:val="decimal"/>
@@ -332,7 +362,7 @@
       <w:rPr>
         <w:rFonts w:ascii="B Nazanin" w:hAnsi="B Nazanin" w:cs="B Nazanin" w:hint="cs"/>
         <w:vanish/>
-        <w:color w:val="auto"/>
+        <w:color w:val="FFFFFF" w:themeColor="background1"/>
       </w:rPr>
     </w:lvl>
     <w:lvl w:ilvl="1">
@@ -568,7 +598,7 @@
 </file>
 
 <file path=word/styles.xml><?xml version="1.0" encoding="utf-8"?>
-<w:styles xmlns:mc="http://schemas.openxmlformats.org/markup-compatibility/2006" xmlns:r="http://schemas.openxmlformats.org/officeDocument/2006/relationships" xmlns:w="http://schemas.openxmlformats.org/wordprocessingml/2006/main" xmlns:w14="http://schemas.microsoft.com/office/word/2010/wordml" xmlns:w15="http://schemas.microsoft.com/office/word/2012/wordml" xmlns:w16cex="http://schemas.microsoft.com/office/word/2018/wordml/cex" xmlns:w16cid="http://schemas.microsoft.com/office/word/2016/wordml/cid" xmlns:w16="http://schemas.microsoft.com/office/word/2018/wordml" xmlns:w16du="http://schemas.microsoft.com/office/word/2023/wordml/word16du" xmlns:w16sdtdh="http://schemas.microsoft.com/office/word/2020/wordml/sdtdatahash" xmlns:w16se="http://schemas.microsoft.com/office/word/2015/wordml/symex" mc:Ignorable="w14 w15 w16se w16cid w16 w16cex w16sdtdh w16du">
+<w:styles xmlns:mc="http://schemas.openxmlformats.org/markup-compatibility/2006" xmlns:r="http://schemas.openxmlformats.org/officeDocument/2006/relationships" xmlns:w="http://schemas.openxmlformats.org/wordprocessingml/2006/main" xmlns:w14="http://schemas.microsoft.com/office/word/2010/wordml" xmlns:w15="http://schemas.microsoft.com/office/word/2012/wordml" xmlns:w16cex="http://schemas.microsoft.com/office/word/2018/wordml/cex" xmlns:w16cid="http://schemas.microsoft.com/office/word/2016/wordml/cid" xmlns:w16="http://schemas.microsoft.com/office/word/2018/wordml" xmlns:w16du="http://schemas.microsoft.com/office/word/2023/wordml/word16du" xmlns:w16sdtdh="http://schemas.microsoft.com/office/word/2020/wordml/sdtdatahash" xmlns:w16sdtfl="http://schemas.microsoft.com/office/word/2024/wordml/sdtformatlock" xmlns:w16se="http://schemas.microsoft.com/office/word/2015/wordml/symex" mc:Ignorable="w14 w15 w16se w16cid w16 w16cex w16sdtdh w16sdtfl w16du">
   <w:docDefaults>
     <w:rPrDefault>
       <w:rPr>
@@ -968,9 +998,9 @@
   <w:style w:type="paragraph" w:default="1" w:styleId="Normal">
     <w:name w:val="Normal"/>
     <w:qFormat/>
-    <w:rsid w:val="005916DD"/>
-    <w:pPr>
-      <w:spacing w:before="100" w:beforeAutospacing="1" w:after="100" w:line="240" w:lineRule="auto"/>
+    <w:rsid w:val="00483516"/>
+    <w:pPr>
+      <w:spacing w:before="-1" w:beforeAutospacing="1" w:line="240" w:lineRule="auto"/>
     </w:pPr>
   </w:style>
   <w:style w:type="paragraph" w:styleId="Heading1">
@@ -980,7 +1010,7 @@
     <w:link w:val="Heading1Char"/>
     <w:uiPriority w:val="1"/>
     <w:qFormat/>
-    <w:rsid w:val="005916DD"/>
+    <w:rsid w:val="00483516"/>
     <w:pPr>
       <w:keepNext/>
       <w:keepLines/>
@@ -998,6 +1028,7 @@
       <w:color w:val="000000"/>
       <w:sz w:val="32"/>
       <w:szCs w:val="36"/>
+      <w14:ligatures w14:val="none"/>
     </w:rPr>
   </w:style>
   <w:style w:type="paragraph" w:styleId="Heading2">
@@ -1009,7 +1040,7 @@
     <w:semiHidden/>
     <w:unhideWhenUsed/>
     <w:qFormat/>
-    <w:rsid w:val="005916DD"/>
+    <w:rsid w:val="00483516"/>
     <w:pPr>
       <w:keepNext/>
       <w:keepLines/>
@@ -1018,7 +1049,6 @@
         <w:numId w:val="9"/>
       </w:numPr>
       <w:spacing w:after="580" w:afterAutospacing="0"/>
-      <w:ind w:left="794" w:hanging="794"/>
       <w:outlineLvl w:val="1"/>
     </w:pPr>
     <w:rPr>
@@ -1028,6 +1058,7 @@
       <w:color w:val="000000"/>
       <w:sz w:val="28"/>
       <w:szCs w:val="32"/>
+      <w14:ligatures w14:val="none"/>
     </w:rPr>
   </w:style>
   <w:style w:type="paragraph" w:styleId="Heading3">
@@ -1039,7 +1070,7 @@
     <w:semiHidden/>
     <w:unhideWhenUsed/>
     <w:qFormat/>
-    <w:rsid w:val="005916DD"/>
+    <w:rsid w:val="00483516"/>
     <w:pPr>
       <w:keepNext/>
       <w:keepLines/>
@@ -1048,7 +1079,6 @@
         <w:numId w:val="9"/>
       </w:numPr>
       <w:spacing w:after="580" w:afterAutospacing="0"/>
-      <w:ind w:left="1225" w:hanging="1225"/>
       <w:outlineLvl w:val="2"/>
     </w:pPr>
     <w:rPr>
@@ -1056,6 +1086,7 @@
       <w:b/>
       <w:bCs/>
       <w:color w:val="000000"/>
+      <w14:ligatures w14:val="none"/>
     </w:rPr>
   </w:style>
   <w:style w:type="paragraph" w:styleId="Heading4">
@@ -1067,7 +1098,7 @@
     <w:semiHidden/>
     <w:unhideWhenUsed/>
     <w:qFormat/>
-    <w:rsid w:val="005916DD"/>
+    <w:rsid w:val="00483516"/>
     <w:pPr>
       <w:keepNext/>
       <w:keepLines/>
@@ -1076,7 +1107,6 @@
         <w:numId w:val="9"/>
       </w:numPr>
       <w:spacing w:after="580" w:afterAutospacing="0"/>
-      <w:ind w:left="1729" w:hanging="1729"/>
       <w:outlineLvl w:val="3"/>
     </w:pPr>
     <w:rPr>
@@ -1086,6 +1116,7 @@
       <w:i/>
       <w:iCs/>
       <w:color w:val="000000"/>
+      <w14:ligatures w14:val="none"/>
     </w:rPr>
   </w:style>
   <w:style w:type="paragraph" w:styleId="Heading5">
@@ -1097,7 +1128,7 @@
     <w:semiHidden/>
     <w:unhideWhenUsed/>
     <w:qFormat/>
-    <w:rsid w:val="005916DD"/>
+    <w:rsid w:val="00483516"/>
     <w:pPr>
       <w:keepNext/>
       <w:keepLines/>
@@ -1106,7 +1137,6 @@
         <w:numId w:val="9"/>
       </w:numPr>
       <w:spacing w:after="580" w:afterAutospacing="0"/>
-      <w:ind w:left="2234" w:hanging="2234"/>
       <w:outlineLvl w:val="4"/>
     </w:pPr>
     <w:rPr>
@@ -1114,6 +1144,7 @@
       <w:b/>
       <w:bCs/>
       <w:color w:val="000000"/>
+      <w14:ligatures w14:val="none"/>
     </w:rPr>
   </w:style>
   <w:style w:type="paragraph" w:styleId="Heading6">
@@ -1125,7 +1156,7 @@
     <w:semiHidden/>
     <w:unhideWhenUsed/>
     <w:qFormat/>
-    <w:rsid w:val="005916DD"/>
+    <w:rsid w:val="00483516"/>
     <w:pPr>
       <w:keepNext/>
       <w:keepLines/>
@@ -1134,7 +1165,6 @@
         <w:numId w:val="9"/>
       </w:numPr>
       <w:spacing w:after="580" w:afterAutospacing="0"/>
-      <w:ind w:left="2739" w:hanging="2739"/>
       <w:outlineLvl w:val="5"/>
     </w:pPr>
     <w:rPr>
@@ -1142,6 +1172,7 @@
       <w:b/>
       <w:bCs/>
       <w:color w:val="000000"/>
+      <w14:ligatures w14:val="none"/>
     </w:rPr>
   </w:style>
   <w:style w:type="paragraph" w:styleId="Heading7">
@@ -1153,7 +1184,7 @@
     <w:semiHidden/>
     <w:unhideWhenUsed/>
     <w:qFormat/>
-    <w:rsid w:val="005916DD"/>
+    <w:rsid w:val="00483516"/>
     <w:pPr>
       <w:keepNext/>
       <w:keepLines/>
@@ -1162,7 +1193,6 @@
         <w:numId w:val="9"/>
       </w:numPr>
       <w:spacing w:after="580" w:afterAutospacing="0"/>
-      <w:ind w:left="3238" w:hanging="3238"/>
       <w:outlineLvl w:val="6"/>
     </w:pPr>
     <w:rPr>
@@ -1172,6 +1202,7 @@
       <w:i/>
       <w:iCs/>
       <w:color w:val="000000"/>
+      <w14:ligatures w14:val="none"/>
     </w:rPr>
   </w:style>
   <w:style w:type="paragraph" w:styleId="Heading8">
@@ -1183,7 +1214,7 @@
     <w:semiHidden/>
     <w:unhideWhenUsed/>
     <w:qFormat/>
-    <w:rsid w:val="005916DD"/>
+    <w:rsid w:val="00483516"/>
     <w:pPr>
       <w:keepNext/>
       <w:keepLines/>
@@ -1192,7 +1223,6 @@
         <w:numId w:val="9"/>
       </w:numPr>
       <w:spacing w:after="580" w:afterAutospacing="0"/>
-      <w:ind w:left="3742" w:hanging="3742"/>
       <w:outlineLvl w:val="7"/>
     </w:pPr>
     <w:rPr>
@@ -1201,6 +1231,7 @@
       <w:bCs/>
       <w:color w:val="000000"/>
       <w:lang w:bidi="fa-IR"/>
+      <w14:ligatures w14:val="none"/>
     </w:rPr>
   </w:style>
   <w:style w:type="paragraph" w:styleId="Heading9">
@@ -1212,7 +1243,7 @@
     <w:semiHidden/>
     <w:unhideWhenUsed/>
     <w:qFormat/>
-    <w:rsid w:val="005916DD"/>
+    <w:rsid w:val="00483516"/>
     <w:pPr>
       <w:keepNext/>
       <w:keepLines/>
@@ -1221,7 +1252,6 @@
         <w:numId w:val="9"/>
       </w:numPr>
       <w:spacing w:after="580" w:afterAutospacing="0"/>
-      <w:ind w:left="4321" w:hanging="4321"/>
       <w:outlineLvl w:val="8"/>
     </w:pPr>
     <w:rPr>
@@ -1234,6 +1264,7 @@
       <w:sz w:val="20"/>
       <w:szCs w:val="20"/>
       <w:lang w:bidi="fa-IR"/>
+      <w14:ligatures w14:val="none"/>
     </w:rPr>
   </w:style>
   <w:style w:type="character" w:default="1" w:styleId="DefaultParagraphFont">
@@ -1241,7 +1272,7 @@
     <w:uiPriority w:val="1"/>
     <w:semiHidden/>
     <w:unhideWhenUsed/>
-    <w:rsid w:val="005916DD"/>
+    <w:rsid w:val="00483516"/>
   </w:style>
   <w:style w:type="table" w:default="1" w:styleId="TableNormal">
     <w:name w:val="Normal Table"/>
@@ -1263,7 +1294,7 @@
     <w:uiPriority w:val="99"/>
     <w:semiHidden/>
     <w:unhideWhenUsed/>
-    <w:rsid w:val="005916DD"/>
+    <w:rsid w:val="00483516"/>
   </w:style>
   <w:style w:type="paragraph" w:styleId="Title">
     <w:name w:val="Title"/>
@@ -1272,7 +1303,7 @@
     <w:link w:val="TitleChar"/>
     <w:uiPriority w:val="2"/>
     <w:qFormat/>
-    <w:rsid w:val="005916DD"/>
+    <w:rsid w:val="00483516"/>
     <w:pPr>
       <w:contextualSpacing/>
       <w:jc w:val="center"/>
@@ -1290,7 +1321,7 @@
     <w:basedOn w:val="Normal"/>
     <w:link w:val="FootnoteTextChar"/>
     <w:uiPriority w:val="10"/>
-    <w:rsid w:val="005916DD"/>
+    <w:rsid w:val="00483516"/>
     <w:rPr>
       <w:sz w:val="20"/>
       <w:szCs w:val="20"/>
@@ -1301,7 +1332,7 @@
     <w:basedOn w:val="DefaultParagraphFont"/>
     <w:link w:val="FootnoteText"/>
     <w:uiPriority w:val="10"/>
-    <w:rsid w:val="005916DD"/>
+    <w:rsid w:val="00483516"/>
     <w:rPr>
       <w:sz w:val="20"/>
       <w:szCs w:val="20"/>
@@ -1312,7 +1343,7 @@
     <w:basedOn w:val="DefaultParagraphFont"/>
     <w:link w:val="Heading1"/>
     <w:uiPriority w:val="1"/>
-    <w:rsid w:val="005916DD"/>
+    <w:rsid w:val="00483516"/>
     <w:rPr>
       <w:rFonts w:eastAsiaTheme="majorEastAsia"/>
       <w:b/>
@@ -1320,6 +1351,7 @@
       <w:color w:val="000000"/>
       <w:sz w:val="32"/>
       <w:szCs w:val="36"/>
+      <w14:ligatures w14:val="none"/>
     </w:rPr>
   </w:style>
   <w:style w:type="character" w:customStyle="1" w:styleId="Heading2Char">
@@ -1328,7 +1360,7 @@
     <w:link w:val="Heading2"/>
     <w:uiPriority w:val="1"/>
     <w:semiHidden/>
-    <w:rsid w:val="005916DD"/>
+    <w:rsid w:val="00483516"/>
     <w:rPr>
       <w:rFonts w:eastAsiaTheme="majorEastAsia"/>
       <w:b/>
@@ -1336,6 +1368,7 @@
       <w:color w:val="000000"/>
       <w:sz w:val="28"/>
       <w:szCs w:val="32"/>
+      <w14:ligatures w14:val="none"/>
     </w:rPr>
   </w:style>
   <w:style w:type="character" w:customStyle="1" w:styleId="Heading3Char">
@@ -1344,12 +1377,13 @@
     <w:link w:val="Heading3"/>
     <w:uiPriority w:val="1"/>
     <w:semiHidden/>
-    <w:rsid w:val="005916DD"/>
+    <w:rsid w:val="00483516"/>
     <w:rPr>
       <w:rFonts w:eastAsiaTheme="majorEastAsia"/>
       <w:b/>
       <w:bCs/>
       <w:color w:val="000000"/>
+      <w14:ligatures w14:val="none"/>
     </w:rPr>
   </w:style>
   <w:style w:type="character" w:customStyle="1" w:styleId="Heading4Char">
@@ -1358,7 +1392,7 @@
     <w:link w:val="Heading4"/>
     <w:uiPriority w:val="1"/>
     <w:semiHidden/>
-    <w:rsid w:val="005916DD"/>
+    <w:rsid w:val="00483516"/>
     <w:rPr>
       <w:rFonts w:eastAsiaTheme="majorEastAsia"/>
       <w:b/>
@@ -1366,6 +1400,7 @@
       <w:i/>
       <w:iCs/>
       <w:color w:val="000000"/>
+      <w14:ligatures w14:val="none"/>
     </w:rPr>
   </w:style>
   <w:style w:type="character" w:customStyle="1" w:styleId="Heading5Char">
@@ -1374,12 +1409,13 @@
     <w:link w:val="Heading5"/>
     <w:uiPriority w:val="1"/>
     <w:semiHidden/>
-    <w:rsid w:val="005916DD"/>
+    <w:rsid w:val="00483516"/>
     <w:rPr>
       <w:rFonts w:eastAsiaTheme="majorEastAsia"/>
       <w:b/>
       <w:bCs/>
       <w:color w:val="000000"/>
+      <w14:ligatures w14:val="none"/>
     </w:rPr>
   </w:style>
   <w:style w:type="character" w:customStyle="1" w:styleId="Heading6Char">
@@ -1388,12 +1424,13 @@
     <w:link w:val="Heading6"/>
     <w:uiPriority w:val="1"/>
     <w:semiHidden/>
-    <w:rsid w:val="005916DD"/>
+    <w:rsid w:val="00483516"/>
     <w:rPr>
       <w:rFonts w:eastAsiaTheme="majorEastAsia"/>
       <w:b/>
       <w:bCs/>
       <w:color w:val="000000"/>
+      <w14:ligatures w14:val="none"/>
     </w:rPr>
   </w:style>
   <w:style w:type="character" w:customStyle="1" w:styleId="Heading7Char">
@@ -1402,7 +1439,7 @@
     <w:link w:val="Heading7"/>
     <w:uiPriority w:val="1"/>
     <w:semiHidden/>
-    <w:rsid w:val="005916DD"/>
+    <w:rsid w:val="00483516"/>
     <w:rPr>
       <w:rFonts w:eastAsiaTheme="majorEastAsia"/>
       <w:b/>
@@ -1410,6 +1447,7 @@
       <w:i/>
       <w:iCs/>
       <w:color w:val="000000"/>
+      <w14:ligatures w14:val="none"/>
     </w:rPr>
   </w:style>
   <w:style w:type="character" w:customStyle="1" w:styleId="Heading8Char">
@@ -1418,13 +1456,14 @@
     <w:link w:val="Heading8"/>
     <w:uiPriority w:val="1"/>
     <w:semiHidden/>
-    <w:rsid w:val="005916DD"/>
+    <w:rsid w:val="00483516"/>
     <w:rPr>
       <w:rFonts w:eastAsiaTheme="majorEastAsia"/>
       <w:b/>
       <w:bCs/>
       <w:color w:val="000000"/>
       <w:lang w:bidi="fa-IR"/>
+      <w14:ligatures w14:val="none"/>
     </w:rPr>
   </w:style>
   <w:style w:type="character" w:customStyle="1" w:styleId="Heading9Char">
@@ -1433,7 +1472,7 @@
     <w:link w:val="Heading9"/>
     <w:uiPriority w:val="1"/>
     <w:semiHidden/>
-    <w:rsid w:val="005916DD"/>
+    <w:rsid w:val="00483516"/>
     <w:rPr>
       <w:rFonts w:eastAsiaTheme="majorEastAsia"/>
       <w:b/>
@@ -1444,6 +1483,7 @@
       <w:sz w:val="20"/>
       <w:szCs w:val="20"/>
       <w:lang w:bidi="fa-IR"/>
+      <w14:ligatures w14:val="none"/>
     </w:rPr>
   </w:style>
   <w:style w:type="character" w:customStyle="1" w:styleId="TitleChar">
@@ -1451,7 +1491,7 @@
     <w:basedOn w:val="DefaultParagraphFont"/>
     <w:link w:val="Title"/>
     <w:uiPriority w:val="2"/>
-    <w:rsid w:val="005916DD"/>
+    <w:rsid w:val="00483516"/>
     <w:rPr>
       <w:rFonts w:eastAsiaTheme="majorEastAsia" w:cs="B Titr"/>
       <w:spacing w:val="-10"/>
@@ -1464,7 +1504,7 @@
     <w:name w:val="page number"/>
     <w:basedOn w:val="DefaultParagraphFont"/>
     <w:uiPriority w:val="12"/>
-    <w:rsid w:val="005916DD"/>
+    <w:rsid w:val="00483516"/>
     <w:rPr>
       <w:sz w:val="20"/>
       <w:szCs w:val="24"/>
@@ -1475,9 +1515,9 @@
     <w:basedOn w:val="Normal"/>
     <w:link w:val="BodyTextChar"/>
     <w:qFormat/>
-    <w:rsid w:val="005916DD"/>
-    <w:pPr>
-      <w:spacing w:line="580" w:lineRule="exact"/>
+    <w:rsid w:val="00483516"/>
+    <w:pPr>
+      <w:spacing w:before="0" w:beforeAutospacing="0" w:after="0" w:afterAutospacing="0" w:line="580" w:lineRule="exact"/>
       <w:ind w:firstLine="227"/>
       <w:jc w:val="lowKashida"/>
     </w:pPr>
@@ -1486,14 +1526,14 @@
     <w:name w:val="Body Text Char"/>
     <w:basedOn w:val="DefaultParagraphFont"/>
     <w:link w:val="BodyText"/>
-    <w:rsid w:val="005916DD"/>
+    <w:rsid w:val="00483516"/>
   </w:style>
   <w:style w:type="paragraph" w:styleId="Caption">
     <w:name w:val="caption"/>
     <w:basedOn w:val="Normal"/>
     <w:next w:val="BodyText"/>
     <w:uiPriority w:val="11"/>
-    <w:rsid w:val="005916DD"/>
+    <w:rsid w:val="00483516"/>
     <w:pPr>
       <w:spacing w:after="580" w:afterAutospacing="0"/>
       <w:jc w:val="center"/>
@@ -1501,6 +1541,7 @@
     <w:rPr>
       <w:sz w:val="22"/>
       <w:szCs w:val="24"/>
+      <w14:ligatures w14:val="none"/>
     </w:rPr>
   </w:style>
   <w:style w:type="paragraph" w:styleId="BlockText">
@@ -1508,7 +1549,7 @@
     <w:basedOn w:val="Normal"/>
     <w:uiPriority w:val="5"/>
     <w:qFormat/>
-    <w:rsid w:val="005916DD"/>
+    <w:rsid w:val="00483516"/>
     <w:pPr>
       <w:pBdr>
         <w:top w:val="single" w:sz="2" w:space="10" w:color="auto"/>
@@ -1530,7 +1571,7 @@
     <w:link w:val="QuoteChar"/>
     <w:uiPriority w:val="5"/>
     <w:qFormat/>
-    <w:rsid w:val="005916DD"/>
+    <w:rsid w:val="00483516"/>
     <w:pPr>
       <w:spacing w:before="200"/>
       <w:ind w:left="851" w:right="851"/>
@@ -1545,7 +1586,7 @@
     <w:basedOn w:val="DefaultParagraphFont"/>
     <w:link w:val="Quote"/>
     <w:uiPriority w:val="5"/>
-    <w:rsid w:val="005916DD"/>
+    <w:rsid w:val="00483516"/>
     <w:rPr>
       <w:color w:val="404040" w:themeColor="text1" w:themeTint="BF"/>
     </w:rPr>
@@ -1556,7 +1597,7 @@
     <w:basedOn w:val="Normal"/>
     <w:link w:val="FooterChar"/>
     <w:uiPriority w:val="9"/>
-    <w:rsid w:val="005916DD"/>
+    <w:rsid w:val="00483516"/>
     <w:pPr>
       <w:tabs>
         <w:tab w:val="center" w:pos="4513"/>
@@ -1575,7 +1616,7 @@
     <w:basedOn w:val="DefaultParagraphFont"/>
     <w:link w:val="Footer"/>
     <w:uiPriority w:val="9"/>
-    <w:rsid w:val="005916DD"/>
+    <w:rsid w:val="00483516"/>
     <w:rPr>
       <w:sz w:val="22"/>
       <w:szCs w:val="24"/>
@@ -1586,7 +1627,7 @@
     <w:basedOn w:val="Normal"/>
     <w:link w:val="HeaderChar"/>
     <w:uiPriority w:val="9"/>
-    <w:rsid w:val="005916DD"/>
+    <w:rsid w:val="00483516"/>
     <w:pPr>
       <w:tabs>
         <w:tab w:val="center" w:pos="4513"/>
@@ -1604,7 +1645,7 @@
     <w:basedOn w:val="DefaultParagraphFont"/>
     <w:link w:val="Header"/>
     <w:uiPriority w:val="9"/>
-    <w:rsid w:val="005916DD"/>
+    <w:rsid w:val="00483516"/>
     <w:rPr>
       <w:sz w:val="22"/>
       <w:szCs w:val="24"/>
@@ -1617,7 +1658,7 @@
     <w:link w:val="SubtitleChar"/>
     <w:uiPriority w:val="3"/>
     <w:qFormat/>
-    <w:rsid w:val="005916DD"/>
+    <w:rsid w:val="00483516"/>
     <w:pPr>
       <w:numPr>
         <w:ilvl w:val="1"/>
@@ -1637,7 +1678,7 @@
     <w:basedOn w:val="DefaultParagraphFont"/>
     <w:link w:val="Subtitle"/>
     <w:uiPriority w:val="3"/>
-    <w:rsid w:val="005916DD"/>
+    <w:rsid w:val="00483516"/>
     <w:rPr>
       <w:rFonts w:eastAsiaTheme="minorEastAsia"/>
       <w:color w:val="5A5A5A" w:themeColor="text1" w:themeTint="A5"/>
@@ -1653,7 +1694,7 @@
     <w:link w:val="IntenseQuoteChar"/>
     <w:uiPriority w:val="5"/>
     <w:qFormat/>
-    <w:rsid w:val="005916DD"/>
+    <w:rsid w:val="00483516"/>
     <w:pPr>
       <w:pBdr>
         <w:top w:val="single" w:sz="4" w:space="10" w:color="auto"/>
@@ -1673,7 +1714,7 @@
     <w:basedOn w:val="DefaultParagraphFont"/>
     <w:link w:val="IntenseQuote"/>
     <w:uiPriority w:val="5"/>
-    <w:rsid w:val="005916DD"/>
+    <w:rsid w:val="00483516"/>
     <w:rPr>
       <w:i/>
       <w:iCs/>
@@ -1684,7 +1725,7 @@
     <w:basedOn w:val="DefaultParagraphFont"/>
     <w:uiPriority w:val="4"/>
     <w:qFormat/>
-    <w:rsid w:val="005916DD"/>
+    <w:rsid w:val="00483516"/>
     <w:rPr>
       <w:i/>
       <w:iCs/>
@@ -1695,7 +1736,7 @@
     <w:basedOn w:val="DefaultParagraphFont"/>
     <w:uiPriority w:val="4"/>
     <w:qFormat/>
-    <w:rsid w:val="005916DD"/>
+    <w:rsid w:val="00483516"/>
     <w:rPr>
       <w:b/>
       <w:bCs/>
@@ -1706,7 +1747,7 @@
     <w:basedOn w:val="Normal"/>
     <w:uiPriority w:val="6"/>
     <w:qFormat/>
-    <w:rsid w:val="005916DD"/>
+    <w:rsid w:val="00483516"/>
     <w:pPr>
       <w:ind w:left="720"/>
       <w:contextualSpacing/>
@@ -1717,14 +1758,14 @@
     <w:basedOn w:val="Normal"/>
     <w:uiPriority w:val="6"/>
     <w:qFormat/>
-    <w:rsid w:val="005916DD"/>
+    <w:rsid w:val="00483516"/>
   </w:style>
   <w:style w:type="paragraph" w:styleId="EndnoteText">
     <w:name w:val="endnote text"/>
     <w:basedOn w:val="Normal"/>
     <w:link w:val="EndnoteTextChar"/>
     <w:uiPriority w:val="10"/>
-    <w:rsid w:val="005916DD"/>
+    <w:rsid w:val="00483516"/>
     <w:pPr>
       <w:spacing w:before="0" w:after="0"/>
     </w:pPr>
@@ -1738,7 +1779,7 @@
     <w:basedOn w:val="DefaultParagraphFont"/>
     <w:link w:val="EndnoteText"/>
     <w:uiPriority w:val="10"/>
-    <w:rsid w:val="005916DD"/>
+    <w:rsid w:val="00483516"/>
     <w:rPr>
       <w:sz w:val="20"/>
       <w:szCs w:val="20"/>
@@ -1752,7 +1793,7 @@
     <w:semiHidden/>
     <w:unhideWhenUsed/>
     <w:qFormat/>
-    <w:rsid w:val="005916DD"/>
+    <w:rsid w:val="00483516"/>
     <w:pPr>
       <w:spacing w:before="0" w:after="0"/>
     </w:pPr>
@@ -1767,7 +1808,7 @@
     <w:link w:val="PlainText"/>
     <w:uiPriority w:val="19"/>
     <w:semiHidden/>
-    <w:rsid w:val="005916DD"/>
+    <w:rsid w:val="00483516"/>
     <w:rPr>
       <w:sz w:val="21"/>
       <w:szCs w:val="21"/>
@@ -1778,7 +1819,7 @@
     <w:basedOn w:val="Normal"/>
     <w:next w:val="Normal"/>
     <w:uiPriority w:val="11"/>
-    <w:rsid w:val="005916DD"/>
+    <w:rsid w:val="00483516"/>
     <w:pPr>
       <w:spacing w:after="0"/>
     </w:pPr>

</xml_diff>